<commit_message>
partie 6 exo 16
</commit_message>
<xml_diff>
--- a/réponce.docx
+++ b/réponce.docx
@@ -1751,7 +1751,7 @@
       </w:pPr>
       <w:r>
         <w:drawing>
-          <wp:inline xmlns:wp14="http://schemas.microsoft.com/office/word/2010/wordprocessingDrawing" wp14:editId="78955444" wp14:anchorId="13430686">
+          <wp:inline xmlns:wp14="http://schemas.microsoft.com/office/word/2010/wordprocessingDrawing" wp14:editId="397D1794" wp14:anchorId="13430686">
             <wp:extent cx="5724525" cy="1200150"/>
             <wp:effectExtent l="0" t="0" r="0" b="0"/>
             <wp:docPr id="795131850" name="drawing"/>
@@ -4636,7 +4636,7 @@
       </w:pPr>
       <w:r>
         <w:drawing>
-          <wp:inline wp14:editId="5B8B2957" wp14:anchorId="42986E41">
+          <wp:inline wp14:editId="72B1F126" wp14:anchorId="42986E41">
             <wp:extent cx="5068007" cy="2534004"/>
             <wp:effectExtent l="0" t="0" r="0" b="0"/>
             <wp:docPr id="502584561" name="drawing"/>
@@ -7655,38 +7655,404 @@
     </w:p>
     <w:p>
       <w:pPr>
-        <w:spacing w:before="0" w:beforeAutospacing="off" w:after="0" w:afterAutospacing="off"/>
-      </w:pPr>
-    </w:p>
-    <w:p>
-      <w:pPr>
-        <w:spacing w:before="0" w:beforeAutospacing="off" w:after="0" w:afterAutospacing="off"/>
-      </w:pPr>
-    </w:p>
-    <w:p>
-      <w:pPr>
-        <w:spacing w:before="0" w:beforeAutospacing="off" w:after="0" w:afterAutospacing="off"/>
-      </w:pPr>
-    </w:p>
-    <w:p>
-      <w:pPr>
-        <w:spacing w:before="0" w:beforeAutospacing="off" w:after="0" w:afterAutospacing="off"/>
-      </w:pPr>
-    </w:p>
-    <w:p>
-      <w:pPr>
-        <w:spacing w:before="0" w:beforeAutospacing="off" w:after="0" w:afterAutospacing="off"/>
-      </w:pPr>
-    </w:p>
-    <w:p>
-      <w:pPr>
-        <w:spacing w:before="0" w:beforeAutospacing="off" w:after="0" w:afterAutospacing="off"/>
-      </w:pPr>
-    </w:p>
-    <w:p>
-      <w:pPr>
-        <w:spacing w:before="0" w:beforeAutospacing="off" w:after="0" w:afterAutospacing="off"/>
-      </w:pPr>
+        <w:pStyle w:val="Normal"/>
+        <w:spacing w:before="0" w:beforeAutospacing="off" w:after="0" w:afterAutospacing="off"/>
+        <w:rPr>
+          <w:rFonts w:ascii="Aptos" w:hAnsi="Aptos" w:eastAsia="Aptos" w:cs="Aptos"/>
+          <w:b w:val="1"/>
+          <w:bCs w:val="1"/>
+          <w:i w:val="1"/>
+          <w:iCs w:val="1"/>
+          <w:noProof w:val="0"/>
+          <w:sz w:val="24"/>
+          <w:szCs w:val="24"/>
+          <w:u w:val="single"/>
+          <w:lang w:val="fr-FR"/>
+        </w:rPr>
+      </w:pPr>
+      <w:r>
+        <w:rPr>
+          <w:rFonts w:ascii="Aptos" w:hAnsi="Aptos" w:eastAsia="Aptos" w:cs="Aptos"/>
+          <w:b w:val="1"/>
+          <w:bCs w:val="1"/>
+          <w:i w:val="1"/>
+          <w:iCs w:val="1"/>
+          <w:noProof w:val="0"/>
+          <w:sz w:val="24"/>
+          <w:szCs w:val="24"/>
+          <w:u w:val="single"/>
+          <w:lang w:val="fr-FR"/>
+        </w:rPr>
+        <w:t>Partie 6 — Mise à jour, destroy et cas avancés</w:t>
+      </w:r>
+    </w:p>
+    <w:p>
+      <w:pPr>
+        <w:spacing w:before="0" w:beforeAutospacing="off" w:after="0" w:afterAutospacing="off"/>
+      </w:pPr>
+    </w:p>
+    <w:p>
+      <w:pPr>
+        <w:spacing w:before="0" w:beforeAutospacing="off" w:after="0" w:afterAutospacing="off"/>
+        <w:rPr>
+          <w:b w:val="1"/>
+          <w:bCs w:val="1"/>
+          <w:i w:val="1"/>
+          <w:iCs w:val="1"/>
+          <w:u w:val="single"/>
+        </w:rPr>
+      </w:pPr>
+      <w:r>
+        <w:rPr>
+          <w:b w:val="1"/>
+          <w:bCs w:val="1"/>
+          <w:i w:val="1"/>
+          <w:iCs w:val="1"/>
+          <w:u w:val="single"/>
+        </w:rPr>
+        <w:t>16.1</w:t>
+      </w:r>
+    </w:p>
+    <w:p>
+      <w:pPr>
+        <w:spacing w:before="0" w:beforeAutospacing="off" w:after="0" w:afterAutospacing="off"/>
+      </w:pPr>
+      <w:r>
+        <w:rPr/>
+        <w:t>Repo git</w:t>
+      </w:r>
+    </w:p>
+    <w:p>
+      <w:pPr>
+        <w:spacing w:before="0" w:beforeAutospacing="off" w:after="0" w:afterAutospacing="off"/>
+      </w:pPr>
+    </w:p>
+    <w:p>
+      <w:pPr>
+        <w:spacing w:before="0" w:beforeAutospacing="off" w:after="0" w:afterAutospacing="off"/>
+        <w:rPr>
+          <w:b w:val="1"/>
+          <w:bCs w:val="1"/>
+          <w:i w:val="1"/>
+          <w:iCs w:val="1"/>
+          <w:u w:val="single"/>
+        </w:rPr>
+      </w:pPr>
+      <w:r>
+        <w:rPr>
+          <w:b w:val="1"/>
+          <w:bCs w:val="1"/>
+          <w:i w:val="1"/>
+          <w:iCs w:val="1"/>
+          <w:u w:val="single"/>
+        </w:rPr>
+        <w:t>16.2</w:t>
+      </w:r>
+    </w:p>
+    <w:p>
+      <w:pPr>
+        <w:spacing w:before="0" w:beforeAutospacing="off" w:after="0" w:afterAutospacing="off"/>
+      </w:pPr>
+      <w:r>
+        <w:rPr/>
+        <w:t>Les ressource affecter sont :</w:t>
+      </w:r>
+    </w:p>
+    <w:p>
+      <w:pPr>
+        <w:pStyle w:val="ListParagraph"/>
+        <w:numPr>
+          <w:ilvl w:val="0"/>
+          <w:numId w:val="18"/>
+        </w:numPr>
+        <w:spacing w:before="0" w:beforeAutospacing="off" w:after="0" w:afterAutospacing="off"/>
+        <w:rPr>
+          <w:sz w:val="24"/>
+          <w:szCs w:val="24"/>
+        </w:rPr>
+      </w:pPr>
+      <w:r>
+        <w:rPr/>
+        <w:t>module.user_service_stack.docker_image.this</w:t>
+      </w:r>
+    </w:p>
+    <w:p>
+      <w:pPr>
+        <w:pStyle w:val="ListParagraph"/>
+        <w:numPr>
+          <w:ilvl w:val="0"/>
+          <w:numId w:val="18"/>
+        </w:numPr>
+        <w:spacing w:before="0" w:beforeAutospacing="off" w:after="0" w:afterAutospacing="off"/>
+        <w:rPr>
+          <w:sz w:val="24"/>
+          <w:szCs w:val="24"/>
+        </w:rPr>
+      </w:pPr>
+      <w:r>
+        <w:rPr/>
+        <w:t>module.user_service_stack.docker_container.this</w:t>
+      </w:r>
+    </w:p>
+    <w:p>
+      <w:pPr>
+        <w:pStyle w:val="ListParagraph"/>
+        <w:numPr>
+          <w:ilvl w:val="0"/>
+          <w:numId w:val="18"/>
+        </w:numPr>
+        <w:spacing w:before="0" w:beforeAutospacing="off" w:after="0" w:afterAutospacing="off"/>
+        <w:rPr>
+          <w:sz w:val="24"/>
+          <w:szCs w:val="24"/>
+        </w:rPr>
+      </w:pPr>
+      <w:r>
+        <w:rPr/>
+        <w:t>docker_image.frontend</w:t>
+      </w:r>
+    </w:p>
+    <w:p>
+      <w:pPr>
+        <w:pStyle w:val="ListParagraph"/>
+        <w:numPr>
+          <w:ilvl w:val="0"/>
+          <w:numId w:val="18"/>
+        </w:numPr>
+        <w:spacing w:before="0" w:beforeAutospacing="off" w:after="0" w:afterAutospacing="off"/>
+        <w:rPr>
+          <w:sz w:val="24"/>
+          <w:szCs w:val="24"/>
+        </w:rPr>
+      </w:pPr>
+      <w:r>
+        <w:rPr/>
+        <w:t>docker_image.product_service</w:t>
+      </w:r>
+    </w:p>
+    <w:p>
+      <w:pPr>
+        <w:pStyle w:val="ListParagraph"/>
+        <w:numPr>
+          <w:ilvl w:val="0"/>
+          <w:numId w:val="18"/>
+        </w:numPr>
+        <w:spacing w:before="0" w:beforeAutospacing="off" w:after="0" w:afterAutospacing="off"/>
+        <w:rPr>
+          <w:sz w:val="24"/>
+          <w:szCs w:val="24"/>
+        </w:rPr>
+      </w:pPr>
+      <w:r>
+        <w:rPr/>
+        <w:t>docker_image.order_service</w:t>
+      </w:r>
+    </w:p>
+    <w:p>
+      <w:pPr>
+        <w:pStyle w:val="ListParagraph"/>
+        <w:numPr>
+          <w:ilvl w:val="0"/>
+          <w:numId w:val="18"/>
+        </w:numPr>
+        <w:spacing w:before="0" w:beforeAutospacing="off" w:after="0" w:afterAutospacing="off"/>
+        <w:rPr>
+          <w:sz w:val="24"/>
+          <w:szCs w:val="24"/>
+        </w:rPr>
+      </w:pPr>
+      <w:r>
+        <w:rPr/>
+        <w:t>docker_container.frontend</w:t>
+      </w:r>
+    </w:p>
+    <w:p>
+      <w:pPr>
+        <w:spacing w:before="0" w:beforeAutospacing="off" w:after="0" w:afterAutospacing="off"/>
+      </w:pPr>
+    </w:p>
+    <w:p>
+      <w:pPr>
+        <w:spacing w:before="0" w:beforeAutospacing="off" w:after="0" w:afterAutospacing="off"/>
+      </w:pPr>
+      <w:r>
+        <w:rPr/>
+        <w:t>Il faut pas</w:t>
+      </w:r>
+      <w:r>
+        <w:rPr/>
+        <w:t xml:space="preserve"> faire que le conteneur car services_image_tag est un tag partagé par plusieurs images dans la configuration. Ce n’est pas un tag isolé pour user-service seulement</w:t>
+      </w:r>
+    </w:p>
+    <w:p>
+      <w:pPr>
+        <w:spacing w:before="0" w:beforeAutospacing="off" w:after="0" w:afterAutospacing="off"/>
+      </w:pPr>
+    </w:p>
+    <w:p>
+      <w:pPr>
+        <w:spacing w:before="0" w:beforeAutospacing="off" w:after="0" w:afterAutospacing="off"/>
+        <w:rPr>
+          <w:b w:val="1"/>
+          <w:bCs w:val="1"/>
+          <w:i w:val="1"/>
+          <w:iCs w:val="1"/>
+          <w:u w:val="single"/>
+        </w:rPr>
+      </w:pPr>
+      <w:r>
+        <w:rPr>
+          <w:b w:val="1"/>
+          <w:bCs w:val="1"/>
+          <w:i w:val="1"/>
+          <w:iCs w:val="1"/>
+          <w:u w:val="single"/>
+        </w:rPr>
+        <w:t>16.3</w:t>
+      </w:r>
+    </w:p>
+    <w:p>
+      <w:pPr>
+        <w:spacing w:before="0" w:beforeAutospacing="off" w:after="0" w:afterAutospacing="off"/>
+      </w:pPr>
+      <w:r>
+        <w:rPr/>
+        <w:t xml:space="preserve">Avec </w:t>
+      </w:r>
+      <w:r>
+        <w:rPr/>
+        <w:t>lifecycle</w:t>
+      </w:r>
+      <w:r>
+        <w:rPr/>
+        <w:t xml:space="preserve"> sur le conteneur </w:t>
+      </w:r>
+      <w:r>
+        <w:rPr/>
+        <w:t>Terraform</w:t>
+      </w:r>
+      <w:r>
+        <w:rPr/>
+        <w:t xml:space="preserve"> ignore les différences du champ image et le conteneur ne sera pas recréé même si l’image change</w:t>
+      </w:r>
+    </w:p>
+    <w:p>
+      <w:pPr>
+        <w:pStyle w:val="Normal"/>
+        <w:spacing w:before="0" w:beforeAutospacing="off" w:after="0" w:afterAutospacing="off"/>
+      </w:pPr>
+      <w:r>
+        <w:rPr/>
+        <w:t xml:space="preserve">Pour forcer la recréation on </w:t>
+      </w:r>
+      <w:r>
+        <w:rPr/>
+        <w:t>peux</w:t>
+      </w:r>
+      <w:r>
+        <w:rPr/>
+        <w:t xml:space="preserve"> </w:t>
+      </w:r>
+      <w:r>
+        <w:rPr/>
+        <w:t>retirer</w:t>
+      </w:r>
+      <w:r>
+        <w:rPr/>
+        <w:t xml:space="preserve"> </w:t>
+      </w:r>
+      <w:r>
+        <w:rPr/>
+        <w:t>ignore_changes</w:t>
+      </w:r>
+      <w:r>
+        <w:rPr/>
+        <w:t xml:space="preserve"> du module </w:t>
+      </w:r>
+      <w:r>
+        <w:rPr/>
+        <w:t>ou</w:t>
+      </w:r>
+      <w:r>
+        <w:rPr/>
+        <w:t xml:space="preserve"> lancer un remplacement forcé.</w:t>
+      </w:r>
+    </w:p>
+    <w:p>
+      <w:pPr>
+        <w:spacing w:before="0" w:beforeAutospacing="off" w:after="0" w:afterAutospacing="off"/>
+      </w:pPr>
+    </w:p>
+    <w:p>
+      <w:pPr>
+        <w:spacing w:before="0" w:beforeAutospacing="off" w:after="0" w:afterAutospacing="off"/>
+        <w:rPr>
+          <w:b w:val="1"/>
+          <w:bCs w:val="1"/>
+          <w:i w:val="1"/>
+          <w:iCs w:val="1"/>
+          <w:u w:val="single"/>
+        </w:rPr>
+      </w:pPr>
+      <w:r>
+        <w:rPr>
+          <w:b w:val="1"/>
+          <w:bCs w:val="1"/>
+          <w:i w:val="1"/>
+          <w:iCs w:val="1"/>
+          <w:u w:val="single"/>
+        </w:rPr>
+        <w:t>16.4</w:t>
+      </w:r>
+    </w:p>
+    <w:p>
+      <w:pPr>
+        <w:pStyle w:val="Normal"/>
+        <w:spacing w:before="0" w:beforeAutospacing="off" w:after="0" w:afterAutospacing="off"/>
+      </w:pPr>
+      <w:r>
+        <w:drawing>
+          <wp:inline wp14:editId="5B30A666" wp14:anchorId="11673AA3">
+            <wp:extent cx="5724525" cy="504825"/>
+            <wp:effectExtent l="0" t="0" r="0" b="0"/>
+            <wp:docPr id="136314385" name="drawing"/>
+            <wp:cNvGraphicFramePr>
+              <a:graphicFrameLocks noChangeAspect="1"/>
+            </wp:cNvGraphicFramePr>
+            <a:graphic>
+              <a:graphicData xmlns:a="http://schemas.openxmlformats.org/drawingml/2006/main" uri="http://schemas.openxmlformats.org/drawingml/2006/picture">
+                <pic:pic xmlns:pic="http://schemas.openxmlformats.org/drawingml/2006/picture">
+                  <pic:nvPicPr>
+                    <pic:cNvPr id="136314385" name="Picture 136314385"/>
+                    <pic:cNvPicPr/>
+                  </pic:nvPicPr>
+                  <pic:blipFill>
+                    <a:blip xmlns:r="http://schemas.openxmlformats.org/officeDocument/2006/relationships" r:embed="rId132983322">
+                      <a:extLst>
+                        <a:ext uri="{28A0092B-C50C-407E-A947-70E740481C1C}">
+                          <a14:useLocalDpi xmlns:a14="http://schemas.microsoft.com/office/drawing/2010/main"/>
+                        </a:ext>
+                      </a:extLst>
+                    </a:blip>
+                    <a:stretch>
+                      <a:fillRect/>
+                    </a:stretch>
+                  </pic:blipFill>
+                  <pic:spPr>
+                    <a:xfrm>
+                      <a:off x="0" y="0"/>
+                      <a:ext cx="5724525" cy="504825"/>
+                    </a:xfrm>
+                    <a:prstGeom prst="rect">
+                      <a:avLst/>
+                    </a:prstGeom>
+                  </pic:spPr>
+                </pic:pic>
+              </a:graphicData>
+            </a:graphic>
+          </wp:inline>
+        </w:drawing>
+      </w:r>
     </w:p>
     <w:p>
       <w:pPr>
@@ -8030,6 +8396,118 @@
 
 <file path=word/numbering.xml><?xml version="1.0" encoding="utf-8"?>
 <w:numbering xmlns:w="http://schemas.openxmlformats.org/wordprocessingml/2006/main">
+  <w:abstractNum xmlns:w="http://schemas.openxmlformats.org/wordprocessingml/2006/main" w:abstractNumId="18">
+    <w:nsid w:val="4c9b7d44"/>
+    <w:multiLevelType xmlns:w="http://schemas.openxmlformats.org/wordprocessingml/2006/main" w:val="hybridMultilevel"/>
+    <w:lvl xmlns:w="http://schemas.openxmlformats.org/wordprocessingml/2006/main" w:ilvl="0">
+      <w:start w:val="1"/>
+      <w:numFmt w:val="bullet"/>
+      <w:lvlText w:val=""/>
+      <w:lvlJc w:val="left"/>
+      <w:pPr>
+        <w:ind w:left="720" w:hanging="360"/>
+      </w:pPr>
+      <w:rPr>
+        <w:rFonts w:hint="default" w:ascii="Symbol" w:hAnsi="Symbol"/>
+      </w:rPr>
+    </w:lvl>
+    <w:lvl xmlns:w="http://schemas.openxmlformats.org/wordprocessingml/2006/main" w:ilvl="1">
+      <w:start w:val="1"/>
+      <w:numFmt w:val="bullet"/>
+      <w:lvlText w:val="o"/>
+      <w:lvlJc w:val="left"/>
+      <w:pPr>
+        <w:ind w:left="1440" w:hanging="360"/>
+      </w:pPr>
+      <w:rPr>
+        <w:rFonts w:hint="default" w:ascii="Courier New" w:hAnsi="Courier New"/>
+      </w:rPr>
+    </w:lvl>
+    <w:lvl xmlns:w="http://schemas.openxmlformats.org/wordprocessingml/2006/main" w:ilvl="2">
+      <w:start w:val="1"/>
+      <w:numFmt w:val="bullet"/>
+      <w:lvlText w:val=""/>
+      <w:lvlJc w:val="left"/>
+      <w:pPr>
+        <w:ind w:left="2160" w:hanging="360"/>
+      </w:pPr>
+      <w:rPr>
+        <w:rFonts w:hint="default" w:ascii="Wingdings" w:hAnsi="Wingdings"/>
+      </w:rPr>
+    </w:lvl>
+    <w:lvl xmlns:w="http://schemas.openxmlformats.org/wordprocessingml/2006/main" w:ilvl="3">
+      <w:start w:val="1"/>
+      <w:numFmt w:val="bullet"/>
+      <w:lvlText w:val=""/>
+      <w:lvlJc w:val="left"/>
+      <w:pPr>
+        <w:ind w:left="2880" w:hanging="360"/>
+      </w:pPr>
+      <w:rPr>
+        <w:rFonts w:hint="default" w:ascii="Symbol" w:hAnsi="Symbol"/>
+      </w:rPr>
+    </w:lvl>
+    <w:lvl xmlns:w="http://schemas.openxmlformats.org/wordprocessingml/2006/main" w:ilvl="4">
+      <w:start w:val="1"/>
+      <w:numFmt w:val="bullet"/>
+      <w:lvlText w:val="o"/>
+      <w:lvlJc w:val="left"/>
+      <w:pPr>
+        <w:ind w:left="3600" w:hanging="360"/>
+      </w:pPr>
+      <w:rPr>
+        <w:rFonts w:hint="default" w:ascii="Courier New" w:hAnsi="Courier New"/>
+      </w:rPr>
+    </w:lvl>
+    <w:lvl xmlns:w="http://schemas.openxmlformats.org/wordprocessingml/2006/main" w:ilvl="5">
+      <w:start w:val="1"/>
+      <w:numFmt w:val="bullet"/>
+      <w:lvlText w:val=""/>
+      <w:lvlJc w:val="left"/>
+      <w:pPr>
+        <w:ind w:left="4320" w:hanging="360"/>
+      </w:pPr>
+      <w:rPr>
+        <w:rFonts w:hint="default" w:ascii="Wingdings" w:hAnsi="Wingdings"/>
+      </w:rPr>
+    </w:lvl>
+    <w:lvl xmlns:w="http://schemas.openxmlformats.org/wordprocessingml/2006/main" w:ilvl="6">
+      <w:start w:val="1"/>
+      <w:numFmt w:val="bullet"/>
+      <w:lvlText w:val=""/>
+      <w:lvlJc w:val="left"/>
+      <w:pPr>
+        <w:ind w:left="5040" w:hanging="360"/>
+      </w:pPr>
+      <w:rPr>
+        <w:rFonts w:hint="default" w:ascii="Symbol" w:hAnsi="Symbol"/>
+      </w:rPr>
+    </w:lvl>
+    <w:lvl xmlns:w="http://schemas.openxmlformats.org/wordprocessingml/2006/main" w:ilvl="7">
+      <w:start w:val="1"/>
+      <w:numFmt w:val="bullet"/>
+      <w:lvlText w:val="o"/>
+      <w:lvlJc w:val="left"/>
+      <w:pPr>
+        <w:ind w:left="5760" w:hanging="360"/>
+      </w:pPr>
+      <w:rPr>
+        <w:rFonts w:hint="default" w:ascii="Courier New" w:hAnsi="Courier New"/>
+      </w:rPr>
+    </w:lvl>
+    <w:lvl xmlns:w="http://schemas.openxmlformats.org/wordprocessingml/2006/main" w:ilvl="8">
+      <w:start w:val="1"/>
+      <w:numFmt w:val="bullet"/>
+      <w:lvlText w:val=""/>
+      <w:lvlJc w:val="left"/>
+      <w:pPr>
+        <w:ind w:left="6480" w:hanging="360"/>
+      </w:pPr>
+      <w:rPr>
+        <w:rFonts w:hint="default" w:ascii="Wingdings" w:hAnsi="Wingdings"/>
+      </w:rPr>
+    </w:lvl>
+  </w:abstractNum>
   <w:abstractNum xmlns:w="http://schemas.openxmlformats.org/wordprocessingml/2006/main" w:abstractNumId="17">
     <w:nsid w:val="1828b871"/>
     <w:multiLevelType xmlns:w="http://schemas.openxmlformats.org/wordprocessingml/2006/main" w:val="hybridMultilevel"/>
@@ -9880,6 +10358,9 @@
       </w:rPr>
     </w:lvl>
   </w:abstractNum>
+  <w:num w:numId="18">
+    <w:abstractNumId w:val="18"/>
+  </w:num>
   <w:num w:numId="17">
     <w:abstractNumId w:val="17"/>
   </w:num>
@@ -10360,7 +10841,7 @@
     <w:name w:val="Hyperlink"/>
     <w:basedOn w:val="DefaultParagraphFont"/>
     <w:unhideWhenUsed/>
-    <w:rsid w:val="13FFFF26"/>
+    <w:rsid w:val="38878DCF"/>
     <w:rPr>
       <w:color w:val="467886"/>
       <w:u w:val="single"/>
@@ -10371,7 +10852,7 @@
     <w:name w:val="List Paragraph"/>
     <w:basedOn w:val="Normal"/>
     <w:qFormat/>
-    <w:rsid w:val="13FFFF26"/>
+    <w:rsid w:val="38878DCF"/>
     <w:pPr>
       <w:spacing/>
       <w:ind w:left="720"/>
@@ -10385,7 +10866,7 @@
     <w:next w:val="Normal"/>
     <w:unhideWhenUsed/>
     <w:qFormat/>
-    <w:rsid w:val="13FFFF26"/>
+    <w:rsid w:val="38878DCF"/>
     <w:rPr>
       <w:rFonts w:eastAsia="" w:cs="" w:eastAsiaTheme="majorEastAsia" w:cstheme="majorBidi"/>
       <w:i w:val="1"/>
@@ -10406,7 +10887,7 @@
     <w:next w:val="Normal"/>
     <w:unhideWhenUsed/>
     <w:qFormat/>
-    <w:rsid w:val="13FFFF26"/>
+    <w:rsid w:val="38878DCF"/>
     <w:rPr>
       <w:rFonts w:eastAsia="" w:cs="" w:eastAsiaTheme="majorEastAsia" w:cstheme="majorBidi"/>
       <w:color w:val="0F4761" w:themeColor="accent1" w:themeTint="FF" w:themeShade="BF"/>

</xml_diff>